<commit_message>
v142: Structural simplification — removal frameworks, judicial selection, registry redesign. §4.1.c judicial removal (first time written); §4.2 Triad replaced with open-candidacy SC selection (MA Director model); §8.4.a renamed Judicial IG Candidate Pool (qualifications to statute); §8.4.e SC Candidate Registry (separate, judge-eligible); §2.1.i Presidential officer appointments and removal; §16.2.a Electoral Commission removal (fills gap); §3.5 scope precisely stated (President/PM/SC explicitly excluded); §2.10 President-only; §4.1.b Senate fallback (not SC); §10.5.a reordered; §3.5 Article VIII coupling removed; §2.9.a removed. Site: 330 provisions, 5 files fixed (Qualified Jurist Pool rename), scenario-judicial-election historical note, all pages voter and convention ready.
</commit_message>
<xml_diff>
--- a/constitution-v141.docx
+++ b/constitution-v141.docx
@@ -2397,6 +2397,26 @@
     </w:p>
     <w:p>
       <w:pPr>
+        <w:spacing w:before="60" w:after="60" w:line="280" w:lineRule="auto"/>
+        <w:jc w:val="both"/>
+      </w:pPr>
+      <w:r>
+        <w:rPr>
+          <w:b/>
+          <w:sz w:val="22"/>
+          <w:color w:val="1B2A4A"/>
+        </w:rPr>
+        <w:t xml:space="preserve">2.1.i Presidential Officer Appointments and Removal: </w:t>
+      </w:r>
+      <w:r>
+        <w:rPr>
+          <w:sz w:val="22"/>
+        </w:rPr>
+        <w:t xml:space="preserve">The President nominates persons to lead the executive functions within the President's domain — including the Director of Intelligence, the Secretary for Foreign Affairs, the Secretary for Defense, and equivalent senior positions established by statute within the defense and foreign affairs domain. The Senate confirms each nomination by simple majority of its full seated membership within a period the Legislature defines by statute; failure to vote within that period results in Deemed Confirmation. All nominations, confirmations, and Deemed Confirmations are published to the National Record System within 24 hours. Presidential Officer Removal: The President may remove any officer confirmed under this provision by submitting a written Notice of Intended Removal to the Senate, published simultaneously to the National Record System. The Senate has 30 days from the date of publication to approve the removal by simple majority of its full seated membership. If the Senate approves within 30 days, the removal takes effect immediately upon the Senate vote. If the Senate does not vote within 30 days, the removal is deemed approved and takes effect on day 31. If the Senate votes to deny the removal within 30 days by simple majority, the officer remains in post and the President may not resubmit a removal notice for the same officer for one year from the date of the Senate's denial. The Senate denial does not prevent the Legislature from initiating removal under §3.5, which operates independently. An officer subject to an active §3.5 proceeding may not be removed by the President under this provision until those proceedings conclude — this prevents the President from using the removal power to obstruct a legislative accountability process.</w:t>
+      </w:r>
+    </w:p>
+    <w:p>
+      <w:pPr>
         <w:pBdr>
           <w:bottom w:val="single" w:color="7A7060" w:sz="2" w:space="4"/>
         </w:pBdr>
@@ -3210,7 +3230,7 @@
           <w:sz w:val="22"/>
           <w:szCs w:val="22"/>
         </w:rPr>
-        <w:t xml:space="preserve">The President may be removed through two political tracks independent of Inspectorate reporting and political accountability mechanisms. These tracks address situations where the President has not committed a technical constitutional violation but has lost the democratic confidence of the Legislature or the citizenry. Both tracks require either cross-institutional consensus or direct citizen participation — they cannot be used as routine political weapons by a simple majority.</w:t>
+        <w:t>The President is removed exclusively through the two tracks of this section. §3.5 impeachment does not apply to the President. These tracks address situations where the President has not committed a technical constitutional violation but has lost the democratic confidence of the Legislature or the citizenry. Both tracks require either cross-institutional consensus or direct citizen participation — they cannot be used as routine political weapons by a simple majority.</w:t>
       </w:r>
     </w:p>
     <w:p>
@@ -4192,7 +4212,7 @@
           <w:sz w:val="22"/>
           <w:szCs w:val="22"/>
         </w:rPr>
-        <w:t xml:space="preserve">This section governs the political impeachment track — initiated by the House and distinct from the Inspectorate reporting and political accountability mechanisms. This section applies exclusively to executive and judicial officers of the Republic. Legislative members of the House and Senate are not subject to this section — their removal is governed exclusively by §3.6 as the specific provision for legislative self-governance, and by the Inspectorate reporting provisions of Article VIII.</w:t>
+        <w:t>This section governs the political impeachment track — initiated by the House and distinct from the Inspectorate reporting and political accountability mechanisms. This section applies to: officers appointed by and serving in the President's executive domain — including intelligence directors, senior diplomatic officers, and military commanders serving in civilian advisory capacities — and to inferior court judges. The President is not subject to this section — presidential removal is governed exclusively by §2.10. The Prime Minister is not subject to this section — PM removal is governed exclusively by the constructive no-confidence mechanism of §2.3.b. Supreme Court justices are not subject to this section — SC removal is governed exclusively by §4.1.c. Legislative members of the House and Senate are not subject to this section — their removal is governed exclusively by §3.6.</w:t>
       </w:r>
     </w:p>
     <w:p>
@@ -4639,16 +4659,16 @@
           <w:sz w:val="22"/>
           <w:szCs w:val="22"/>
         </w:rPr>
-        <w:t xml:space="preserve">PM Failure — Supreme Court Nomination: </w:t>
-      </w:r>
-      <w:r>
-        <w:rPr>
-          <w:rFonts w:ascii="Times New Roman" w:cs="Times New Roman" w:eastAsia="Times New Roman" w:hAnsi="Times New Roman"/>
-          <w:color w:val="000000"/>
-          <w:sz w:val="22"/>
-          <w:szCs w:val="22"/>
-        </w:rPr>
-        <w:t xml:space="preserve">Where the PM fails to nominate within 90 days and the Supreme Court nominates directly from the Qualified Jurist Registry, the Judicial Inspectorate's existing vetting of that Registry record under §8.4.a serves as the equivalent disclosure review for that nomination — no separate EI review is required for SC-originated nominations. If the PM fails to nominate within 90 days of a vacancy, the Supreme Court nominates directly from the Qualified Jurist Registry; that nomination proceeds to House confirmation on the same supermajority standard and Deemed Confirmed timeline.</w:t>
+        <w:t xml:space="preserve">PM Failure — Senate Nomination: </w:t>
+      </w:r>
+      <w:r>
+        <w:rPr>
+          <w:rFonts w:ascii="Times New Roman" w:cs="Times New Roman" w:eastAsia="Times New Roman" w:hAnsi="Times New Roman"/>
+          <w:color w:val="000000"/>
+          <w:sz w:val="22"/>
+          <w:szCs w:val="22"/>
+        </w:rPr>
+        <w:t>Where the PM fails to nominate within 90 days of a vacancy, the Senate may nominate a candidate. The Senate's nominee must meet the same professional qualifications the PM would be expected to apply and is subject to the same EI disclosure review as a PM-nominated candidate under §4.1.b before the House confirmation vote. That nomination proceeds to House confirmation on the same supermajority standard and Deemed Confirmed timeline.</w:t>
       </w:r>
     </w:p>
     <w:p>
@@ -4715,7 +4735,27 @@
           <w:sz w:val="22"/>
           <w:szCs w:val="22"/>
         </w:rPr>
-        <w:t xml:space="preserve">Inferior court judges, once commissioned under §4.1.b, serve during good behavior — their authority as commissioned judges is not time-limited. The Legislature may by statute establish a maximum service age or a maximum total service period for inferior court judges, provided the maximum total service period is not less than 15 years from the date of first commissioning. The Legislature may not establish fixed-term appointments of shorter duration — a judge may not be commissioned for a term of less than 15 years. This protection ensures that the three-track removal system of §4.1.c is the operative mechanism of judicial accountability. A judge whose statutory maximum service period expires is not removed through any of the three tracks; the service period expiration is a constitutional transition of a different kind, and the Legislature must by statute define the transition process including the vacancy-filling timeline that governs service period expirations.</w:t>
+        <w:t>Inferior court judges, once commissioned under §4.1.b, serve during good behavior — their authority as commissioned judges is not time-limited. The Legislature may by statute establish a maximum service age or a maximum total service period for inferior court judges, provided the maximum total service period is not less than 15 years from the date of first commissioning. The Legislature may not establish fixed-term appointments of shorter duration — a judge may not be commissioned for a term of less than 15 years. This protection ensures that the removal mechanism of §4.1.c is the operative mechanism of judicial accountability. A judge whose statutory maximum service period expires is not removed through any of the three tracks; the service period expiration is a constitutional transition of a different kind, and the Legislature must by statute define the transition process including the vacancy-filling timeline that governs service period expirations.</w:t>
+      </w:r>
+    </w:p>
+    <w:p>
+      <w:pPr>
+        <w:spacing w:before="60" w:after="60" w:line="280" w:lineRule="auto"/>
+        <w:jc w:val="both"/>
+      </w:pPr>
+      <w:r>
+        <w:rPr>
+          <w:b/>
+          <w:sz w:val="22"/>
+          <w:color w:val="1B2A4A"/>
+        </w:rPr>
+        <w:t xml:space="preserve">4.1.c Judicial Removal: </w:t>
+      </w:r>
+      <w:r>
+        <w:rPr>
+          <w:sz w:val="22"/>
+        </w:rPr>
+        <w:t xml:space="preserve">Supreme Court Justice Removal: A Supreme Court justice may be removed by a concurrent vote of 2/3 of the full seated membership of both chambers. The House must first pass a Statement of Grounds — a written document specifying the specific conduct, decisions, or failures constituting the basis for removal, published to the National Record System simultaneously with the House vote — by a 2/3 majority of its full seated membership. The Senate then conducts a trial under §3.5.c mechanics, limited to the grounds stated. The Senate may not convict on grounds not included in the Statement. Removal requires a 2/3 majority of the full seated Senate membership. Both thresholds are of full seated membership, not merely those present on the day of the vote. No popular recall mechanism applies to Supreme Court justices — judicial independence requires insulation from democratic pressure on specific rulings. Inferior court judges are removed through the §3.5 impeachment process, which applies to all inferior court judges in full.</w:t>
       </w:r>
     </w:p>
     <w:p>
@@ -4760,7 +4800,7 @@
           <w:sz w:val="22"/>
           <w:szCs w:val="22"/>
         </w:rPr>
-        <w:t xml:space="preserve">Each open Supreme Court seat is filled through an open-candidacy election process. Any citizen on the Qualified Jurist Registry maintained by the Judicial Inspectorate may register as a candidate. A Judicial Selection Board publishes an advisory assessment of registered candidates. Citizens elect justices by national Ranked Choice Vote. No political branch nominates or controls access to the ballot — the Registry is the eligibility filter, the Board is the expert voice, and the electorate makes the final determination.</w:t>
+        <w:t>Each open Supreme Court seat is filled through an open-candidacy election process. Any citizen on the Supreme Court Candidate Registry maintained by the Judicial Inspectorate may register as a candidate. A Judicial Selection Board publishes an advisory assessment of registered candidates. Citizens elect justices by national Ranked Choice Vote. No political branch nominates or controls access to the ballot — the Registry is the eligibility filter, the Board is the expert voice, and the electorate makes the final determination.</w:t>
       </w:r>
     </w:p>
     <w:p>
@@ -4801,7 +4841,7 @@
           <w:sz w:val="22"/>
           <w:szCs w:val="22"/>
         </w:rPr>
-        <w:t xml:space="preserve">Any citizen whose name appears on the Judicial Inspectorate's Qualified Jurist Registry may register as a candidate for an open Supreme Court seat by filing a complete disclosure record with the Executive Inspectorate. The disclosure record must include: full professional history, all judicial or legal appointments held, any financial interests that could affect impartiality, and confirmation of continued Registry eligibility. The EI reviews each disclosure record for factual accuracy and completeness within 14 days of filing and publishes its findings to the National Record System. A candidate whose disclosure record contains a material inaccuracy or who no longer meets Registry criteria is removed from the ballot; the EI publishes the grounds. All other registered candidates proceed to JI certification and the public election. The Electoral Commission administers all Supreme Court elections and may not exclude any EI-reviewed, JI-certified candidate from the ballot.</w:t>
+        <w:t>Any citizen whose name appears on the Judicial Inspectorate's Supreme Court Candidate Registry maintained under §8.4.e may register as a candidate for an open Supreme Court seat by filing a complete disclosure record with the Executive Inspectorate. The disclosure record must include: full professional history, all judicial or legal appointments held, any financial interests that could affect impartiality, and confirmation of continued Registry eligibility. The EI reviews each disclosure record for factual accuracy and completeness within 14 days of filing and publishes its findings to the National Record System. A candidate whose disclosure record contains a material inaccuracy or who no longer meets Registry criteria is removed from the ballot; the EI publishes the grounds. All other registered candidates proceed to JI certification and the public election. The Electoral Commission administers all Supreme Court elections and may not exclude any EI-reviewed, JI-certified candidate from the ballot.</w:t>
       </w:r>
     </w:p>
     <w:p>
@@ -4853,7 +4893,7 @@
           <w:sz w:val="22"/>
           <w:szCs w:val="22"/>
         </w:rPr>
-        <w:t xml:space="preserve">Before any candidate may appear on the ballot, the Judicial Inspectorate confirms that the candidate remains on the Qualified Jurist Registry, that no disqualifying change in circumstances has occurred since Registry admission, and that the specific eligibility criteria of §8.4.a continue to be met. The JI does not conduct a new independent assessment — it confirms Registry status. Candidates who fail JI certification may not proceed to the public election; the JI publishes the grounds for any certification refusal to the National Record System. A candidate who disputes a certification refusal may challenge it before an Appellate Court within 14 days; the candidate remains listed as pending during that review period. All certification determinations are published to the National Record System.</w:t>
+        <w:t>Before any candidate may appear on the ballot, the Judicial Inspectorate confirms that the candidate remains on the Supreme Court Candidate Registry, that no disqualifying change in circumstances has occurred since Registry admission, and that the specific eligibility criteria of §8.4.e continue to be met. The JI does not conduct a new independent assessment — it confirms Registry status. Candidates who fail JI certification may not proceed to the public election; the JI publishes the grounds for any certification refusal to the National Record System. A candidate who disputes a certification refusal may challenge it before an Appellate Court within 14 days; the candidate remains listed as pending during that review period. All certification determinations are published to the National Record System.</w:t>
       </w:r>
     </w:p>
     <w:p>
@@ -6922,7 +6962,7 @@
           <w:sz w:val="22"/>
           <w:szCs w:val="22"/>
         </w:rPr>
-        <w:t xml:space="preserve">Audits the court system for compliance with judicial scope and independence; maintains the Qualified Jurist Registry; vets judicial nominees and Electoral Commission candidates; conducts eligibility screens on referendum petitions; and audits the Electoral Commission annually.</w:t>
+        <w:t>Audits the court system for compliance with judicial scope and independence; maintains the Supreme Court Candidate Registry (§8.4.e); vets judicial nominees and Electoral Commission candidates; conducts eligibility screens on referendum petitions; and audits the Electoral Commission annually.</w:t>
       </w:r>
     </w:p>
     <w:p>
@@ -7107,28 +7147,22 @@
     </w:p>
     <w:p>
       <w:pPr>
-        <w:spacing w:after="60" w:before="60" w:line="280" w:lineRule="auto"/>
-        <w:jc w:val="both"/>
-      </w:pPr>
-      <w:r>
-        <w:rPr>
-          <w:rFonts w:ascii="Times New Roman" w:cs="Times New Roman" w:eastAsia="Times New Roman" w:hAnsi="Times New Roman"/>
-          <w:b/>
-          <w:bCs/>
-          <w:color w:val="1B2A4A"/>
-          <w:sz w:val="22"/>
-          <w:szCs w:val="22"/>
-        </w:rPr>
-        <w:t xml:space="preserve">8.4.a The Qualified Jurist Pool: </w:t>
-      </w:r>
-      <w:r>
-        <w:rPr>
-          <w:rFonts w:ascii="Times New Roman" w:cs="Times New Roman" w:eastAsia="Times New Roman" w:hAnsi="Times New Roman"/>
-          <w:color w:val="000000"/>
-          <w:sz w:val="22"/>
-          <w:szCs w:val="22"/>
-        </w:rPr>
-        <w:t xml:space="preserve">Maintained by the outgoing Judicial IG. A candidate seeking Registry inclusion must submit a registration record to the Judicial Inspectorate. The record must include professional background, credentials in constitutional law, financial disclosures, and the candidate's complete prior government position history. The JI reviews the submitted record for factual accuracy, applies the Registry criteria — knowledge of constitutional law, no government position in the prior 10 years, no financial conflicts of interest, no prior disqualifying conduct — and publishes the record together with its recommendation to the National Record System. These criteria are fixed and may only be altered by constitutional amendment. The existing appeals process under §8.9.d applies to any Registry exclusion determination. Any citizen who identifies a discrepancy in a published registration record may petition their elected representative.</w:t>
+        <w:spacing w:before="60" w:after="60" w:line="280" w:lineRule="auto"/>
+        <w:jc w:val="both"/>
+      </w:pPr>
+      <w:r>
+        <w:rPr>
+          <w:b/>
+          <w:sz w:val="22"/>
+          <w:color w:val="1B2A4A"/>
+        </w:rPr>
+        <w:t xml:space="preserve">8.4.a Judicial IG Candidate Pool: </w:t>
+      </w:r>
+      <w:r>
+        <w:rPr>
+          <w:sz w:val="22"/>
+        </w:rPr>
+        <w:t>Maintained by the Judicial Inspectorate. The Pool consists of persons with the analytical, research, and writing competence to perform systematic fact-finding and clear reporting within the judicial domain. The Judicial IG's function is information-gathering and factual reporting — not legal determination. Accordingly, specific professional qualifications for Pool membership are defined by the Legislature by statute, and must reflect the research and reporting nature of the role rather than judicial or legal credentials as such. The constitutional minimum requirements for Pool membership are: no elected or appointed government position within the prior 10 years; no financial interest in any entity regulated by the Republic; and no criminal conviction for conduct committed while holding any government position. These minimums may not be reduced by statute — the Legislature may only add to them. The existing appeals process under §8.9.d applies to any Pool exclusion determination.</w:t>
       </w:r>
     </w:p>
     <w:p>
@@ -7207,6 +7241,26 @@
           <w:szCs w:val="22"/>
         </w:rPr>
         <w:t xml:space="preserve">Inspectorate staff retain their constitutional mandate to continue all mandatory publication and audit functions under the most recent IG's standing orders during any IG vacancy, including vacancy caused by death. Staff actions during an IG vacancy are subject to full review upon appointment of a successor IG. Where two or more Inspectorates experience simultaneous IG vacancies due to a single external event qualifying as a catastrophic event under §2.8, the §8.4.c Constitutional Emergency Panel provision activates immediately for each vacant Inspectorate without requiring separate Pool depletion findings. The Senate, by simple majority of surviving members under the §3.2.g survivor quorum provision, appoints temporary IGs for each simultaneously vacant position within 14 days: the Qualified Jurist Pool process applies to the Judicial IG vacancy; career senior civil servants from outside the affected Inspectorates, nominated by the surviving Inspectorates jointly, fill Legislative and Executive IG vacancies. All such temporary appointments are subject to Senate confirmation under §3.2.g.</w:t>
+      </w:r>
+    </w:p>
+    <w:p>
+      <w:pPr>
+        <w:spacing w:before="60" w:after="60" w:line="280" w:lineRule="auto"/>
+        <w:jc w:val="both"/>
+      </w:pPr>
+      <w:r>
+        <w:rPr>
+          <w:b/>
+          <w:sz w:val="22"/>
+          <w:color w:val="1B2A4A"/>
+        </w:rPr>
+        <w:t xml:space="preserve">8.4.e Supreme Court Candidate Registry: </w:t>
+      </w:r>
+      <w:r>
+        <w:rPr>
+          <w:sz w:val="22"/>
+        </w:rPr>
+        <w:t>Maintained by the Judicial Inspectorate separately from the Judicial IG Candidate Pool of §8.4.a. The SC Registry serves exclusively as the eligibility register for Supreme Court candidacy under §4.2. Any citizen meeting the following criteria may apply for inclusion: (1) a minimum of 15 years of legal practice, or a minimum of 10 years of service as a judge on any court within the Republic's jurisdiction, or both — prior or current judicial service does not disqualify; (2) active Republic citizenship at time of application; (3) no current position in the executive or legislative branches of the federal government; (4) no financial interest that would systematically affect impartiality on the Supreme Court; and (5) no criminal conviction for conduct committed while holding federal office. The Judicial Inspectorate reviews submitted registration records for factual accuracy against these criteria and publishes findings to the National Record System within 21 days of submission. Registry inclusion does not expire — a member remains on the Registry unless they no longer meet the criteria or voluntarily withdraw. The Inspectorate publishes an updated Registry annually to the NRS. Appeals of exclusion determinations proceed under §8.9.d.</w:t>
       </w:r>
     </w:p>
     <w:p>
@@ -9181,7 +9235,7 @@
           <w:sz w:val="22"/>
           <w:szCs w:val="22"/>
         </w:rPr>
-        <w:t xml:space="preserve">The Republic provides standardized housing for officials in session — no luxury stipends. All officials use the same healthcare, retirement, and public infrastructure as the citizens they serve. Compensation is defined by House statute under §10.6. The standard for all official benefits, allowances, and limitations is that of a civil service employee in a comparable role. Departure from this standard is permitted only where an official's constitutional responsibilities create a demonstrable operational need, and only to the minimum extent that need requires.</w:t>
+        <w:t>The standard for all official benefits, allowances, and limitations is that of a civil service employee in a comparable role. Departure from this standard is permitted only where an official's constitutional responsibilities create a demonstrable operational need, and only to the minimum extent that need requires. This standard covers: housing in session — standardized, no luxury stipends; healthcare and retirement — the same systems as the citizens officials serve; and compensation, defined by House statute under §10.6.</w:t>
       </w:r>
     </w:p>
     <w:p>
@@ -12422,6 +12476,26 @@
           <w:szCs w:val="23"/>
         </w:rPr>
         <w:t xml:space="preserve">Section 16.3 — Constitutional Properties of the National Voting System</w:t>
+      </w:r>
+    </w:p>
+    <w:p>
+      <w:pPr>
+        <w:spacing w:before="60" w:after="60" w:line="280" w:lineRule="auto"/>
+        <w:jc w:val="both"/>
+      </w:pPr>
+      <w:r>
+        <w:rPr>
+          <w:b/>
+          <w:sz w:val="22"/>
+          <w:color w:val="1B2A4A"/>
+        </w:rPr>
+        <w:t xml:space="preserve">16.2.a Electoral Commission Removal: </w:t>
+      </w:r>
+      <w:r>
+        <w:rPr>
+          <w:sz w:val="22"/>
+        </w:rPr>
+        <w:t xml:space="preserve">Electoral Commission members may be removed only through For-Cause proceedings. No-Cause removal is not available — the Electoral Commission administers all national elections and referenda; a no-cause removal mechanism would create an unacceptable vector for electoral manipulation by any temporary legislative majority. For-Cause Removal Grounds: documented dereliction of duty, incapacity to perform the functions of the office, undisclosed conflict of interest, criminal conviction, or conduct that materially compromises the integrity of any election or referendum. Process: The Judicial Inspectorate — which audits the Electoral Commission annually under §8.1.c — must publish a documented finding of specific misconduct to the National Record System before any removal vote may proceed. The finding is published no later than 30 days after a removal motion is filed. The finding is advisory — it does not compel removal — but no removal vote may be held without it. Following publication of the JI finding, removal requires a 2/3 vote of both chambers simultaneously, calculated against full seated membership of each chamber. A member subject to For-Cause proceedings continues all duties until the removal vote concludes; they may not be suspended from duties pending the JI finding or the legislative vote. Upon removal, the seat is filled through a special election held within 90 days under the same process as a regular Electoral Commission election. The replacement serves a full new non-renewable 6-year term from the date of certification, not the remainder of the removed member's term.</w:t>
       </w:r>
     </w:p>
     <w:p>

</xml_diff>